<commit_message>
docs: Docker stack verified — README, infra guide and final report updated
Co-Authored-By: Claude Opus 5.5 <noreply@anthropic.com>
</commit_message>
<xml_diff>
--- a/docs/reports/RAMEI-Final-Report.docx
+++ b/docs/reports/RAMEI-Final-Report.docx
@@ -3584,6 +3584,14 @@
       </w:r>
       <w:r>
         <w:t xml:space="preserve">, including WebSocket upgrades. A Compose file wires the stack together, with PostgreSQL as an optional profile.</w:t>
+      </w:r>
+    </w:p>
+    <w:p>
+      <w:pPr>
+        <w:jc w:val="both"/>
+      </w:pPr>
+      <w:r>
+        <w:t xml:space="preserve">The stack was built and run under Docker Desktop on the development laptop. Through nginx, the containerized API analysed the end-to-end test video on CPU in 14 s (warm), produced the same results as the GPU run, and served the live-stream WebSocket. Running it surfaced and fixed six deployment defects that the local setup had hidden: undeclared tokenizer dependencies, missing graphics libraries for face detection, cache and data paths that were not writable by the non-root user, host paths leaking into the container, security headers not applied to dashboard pages, and an inline script blocked by the content security policy.</w:t>
       </w:r>
     </w:p>
     <w:p>
@@ -11996,7 +12004,7 @@
         <w:t xml:space="preserve">Local-first implementation choices</w:t>
       </w:r>
       <w:r>
-        <w:t xml:space="preserve"> (ADR-0008) are adequate for a demo, not for multi-tenant production. The Docker images have not been built on the development machine.</w:t>
+        <w:t xml:space="preserve"> (ADR-0008) are adequate for a demo, not for multi-tenant production. The container stack has run on one machine only, without TLS or PostgreSQL, and the API image runs inference on CPU.</w:t>
       </w:r>
     </w:p>
     <w:p>

</xml_diff>